<commit_message>
v0.234 — as prontas ganham a Destreza que a Defesa pede, e o papel entra na Defesa por fora
- O ±2 de Defesa do papel e termo a parte (decisao do Mizuki): pela Destreza o
  Baluarte so fechava do nivel 10 ao 17. Peca 26 §3 e §3.4.
- Arranjos: Tsuchigumo 3·3·3·1·0, Hitotsume 0·3·2·1·3, Kitsune 0·3·1·2·3 com o
  marco do 10 na Destreza, Oni 3·3·3·0·1 (Defesa 12/13). Campo `marcos` no dados.js,
  e o make.js recusa arranjo que nao fecha.
- O capitulo 8 do livro do Bestiario tinha parado antes dos papeis (v0.224) e foi
  regerado. Os quatro gerar-*.py ganharam --conferir, e a 9.5 do
  conferir-bestiario.py roda os quatro. Dez perturbacoes e dois contra-testes (§7.9).
- bloco-de-inimigo.docx/.pdf e os dois PDFs do livro refeitos.

Co-Authored-By: Claude Opus 5 <noreply@anthropic.com>
</commit_message>
<xml_diff>
--- a/sistema/05-material/bloco-de-inimigo.docx
+++ b/sistema/05-material/bloco-de-inimigo.docx
@@ -1937,7 +1937,7 @@
         <w:t xml:space="preserve">Nenhum número foi escolhido:</w:t>
       </w:r>
       <w:r>
-        <w:t xml:space="preserve"> todos saem das tabelas do fim desta folha, e os atributos cabem no orçamento de nove pontos com teto </w:t>
+        <w:t xml:space="preserve"> todos saem das tabelas do fim desta folha, e os atributos cabem na criação da peça 2, com nove pontos e teto </w:t>
       </w:r>
       <w:r>
         <w:rPr>
@@ -1949,7 +1949,7 @@
         <w:t xml:space="preserve">3</w:t>
       </w:r>
       <w:r>
-        <w:t xml:space="preserve"> que a peça 2 dá a qualquer ficha.</w:t>
+        <w:t xml:space="preserve">, e dez no chefe.</w:t>
       </w:r>
     </w:p>
     <w:p>
@@ -5848,7 +5848,7 @@
                 <w:sz w:val="17"/>
                 <w:szCs w:val="17"/>
               </w:rPr>
-              <w:t xml:space="preserve">2</w:t>
+              <w:t xml:space="preserve">3</w:t>
             </w:r>
           </w:p>
         </w:tc>
@@ -7245,6 +7245,34 @@
                 <w:sz w:val="17"/>
                 <w:szCs w:val="17"/>
               </w:rPr>
+              <w:t xml:space="preserve">3</w:t>
+            </w:r>
+          </w:p>
+        </w:tc>
+        <w:tc>
+          <w:tcPr>
+            <w:tcW w:type="dxa" w:w="1920"/>
+            <w:tcMar>
+              <w:top w:type="dxa" w:w="26"/>
+              <w:left w:type="dxa" w:w="90"/>
+              <w:bottom w:type="dxa" w:w="26"/>
+              <w:right w:type="dxa" w:w="90"/>
+            </w:tcMar>
+            <w:vAlign w:val="center"/>
+          </w:tcPr>
+          <w:p>
+            <w:pPr>
+              <w:spacing w:after="18" w:before="18" w:line="215"/>
+              <w:jc w:val="center"/>
+            </w:pPr>
+            <w:r>
+              <w:rPr>
+                <w:b w:val="false"/>
+                <w:bCs w:val="false"/>
+                <w:color w:val="251727"/>
+                <w:sz w:val="17"/>
+                <w:szCs w:val="17"/>
+              </w:rPr>
               <w:t xml:space="preserve">2</w:t>
             </w:r>
           </w:p>
@@ -7273,35 +7301,7 @@
                 <w:sz w:val="17"/>
                 <w:szCs w:val="17"/>
               </w:rPr>
-              <w:t xml:space="preserve">2</w:t>
-            </w:r>
-          </w:p>
-        </w:tc>
-        <w:tc>
-          <w:tcPr>
-            <w:tcW w:type="dxa" w:w="1920"/>
-            <w:tcMar>
-              <w:top w:type="dxa" w:w="26"/>
-              <w:left w:type="dxa" w:w="90"/>
-              <w:bottom w:type="dxa" w:w="26"/>
-              <w:right w:type="dxa" w:w="90"/>
-            </w:tcMar>
-            <w:vAlign w:val="center"/>
-          </w:tcPr>
-          <w:p>
-            <w:pPr>
-              <w:spacing w:after="18" w:before="18" w:line="215"/>
-              <w:jc w:val="center"/>
-            </w:pPr>
-            <w:r>
-              <w:rPr>
-                <w:b w:val="false"/>
-                <w:bCs w:val="false"/>
-                <w:color w:val="251727"/>
-                <w:sz w:val="17"/>
-                <w:szCs w:val="17"/>
-              </w:rPr>
-              <w:t xml:space="preserve">2</w:t>
+              <w:t xml:space="preserve">1</w:t>
             </w:r>
           </w:p>
         </w:tc>
@@ -8378,63 +8378,63 @@
                 <w:sz w:val="17"/>
                 <w:szCs w:val="17"/>
               </w:rPr>
+              <w:t xml:space="preserve">3 (4 do nível 10)</w:t>
+            </w:r>
+          </w:p>
+        </w:tc>
+        <w:tc>
+          <w:tcPr>
+            <w:tcW w:type="dxa" w:w="1920"/>
+            <w:tcMar>
+              <w:top w:type="dxa" w:w="26"/>
+              <w:left w:type="dxa" w:w="90"/>
+              <w:bottom w:type="dxa" w:w="26"/>
+              <w:right w:type="dxa" w:w="90"/>
+            </w:tcMar>
+            <w:vAlign w:val="center"/>
+          </w:tcPr>
+          <w:p>
+            <w:pPr>
+              <w:spacing w:after="18" w:before="18" w:line="215"/>
+              <w:jc w:val="center"/>
+            </w:pPr>
+            <w:r>
+              <w:rPr>
+                <w:b w:val="false"/>
+                <w:bCs w:val="false"/>
+                <w:color w:val="251727"/>
+                <w:sz w:val="17"/>
+                <w:szCs w:val="17"/>
+              </w:rPr>
+              <w:t xml:space="preserve">1</w:t>
+            </w:r>
+          </w:p>
+        </w:tc>
+        <w:tc>
+          <w:tcPr>
+            <w:tcW w:type="dxa" w:w="1920"/>
+            <w:tcMar>
+              <w:top w:type="dxa" w:w="26"/>
+              <w:left w:type="dxa" w:w="90"/>
+              <w:bottom w:type="dxa" w:w="26"/>
+              <w:right w:type="dxa" w:w="90"/>
+            </w:tcMar>
+            <w:vAlign w:val="center"/>
+          </w:tcPr>
+          <w:p>
+            <w:pPr>
+              <w:spacing w:after="18" w:before="18" w:line="215"/>
+              <w:jc w:val="center"/>
+            </w:pPr>
+            <w:r>
+              <w:rPr>
+                <w:b w:val="false"/>
+                <w:bCs w:val="false"/>
+                <w:color w:val="251727"/>
+                <w:sz w:val="17"/>
+                <w:szCs w:val="17"/>
+              </w:rPr>
               <w:t xml:space="preserve">2</w:t>
-            </w:r>
-          </w:p>
-        </w:tc>
-        <w:tc>
-          <w:tcPr>
-            <w:tcW w:type="dxa" w:w="1920"/>
-            <w:tcMar>
-              <w:top w:type="dxa" w:w="26"/>
-              <w:left w:type="dxa" w:w="90"/>
-              <w:bottom w:type="dxa" w:w="26"/>
-              <w:right w:type="dxa" w:w="90"/>
-            </w:tcMar>
-            <w:vAlign w:val="center"/>
-          </w:tcPr>
-          <w:p>
-            <w:pPr>
-              <w:spacing w:after="18" w:before="18" w:line="215"/>
-              <w:jc w:val="center"/>
-            </w:pPr>
-            <w:r>
-              <w:rPr>
-                <w:b w:val="false"/>
-                <w:bCs w:val="false"/>
-                <w:color w:val="251727"/>
-                <w:sz w:val="17"/>
-                <w:szCs w:val="17"/>
-              </w:rPr>
-              <w:t xml:space="preserve">1</w:t>
-            </w:r>
-          </w:p>
-        </w:tc>
-        <w:tc>
-          <w:tcPr>
-            <w:tcW w:type="dxa" w:w="1920"/>
-            <w:tcMar>
-              <w:top w:type="dxa" w:w="26"/>
-              <w:left w:type="dxa" w:w="90"/>
-              <w:bottom w:type="dxa" w:w="26"/>
-              <w:right w:type="dxa" w:w="90"/>
-            </w:tcMar>
-            <w:vAlign w:val="center"/>
-          </w:tcPr>
-          <w:p>
-            <w:pPr>
-              <w:spacing w:after="18" w:before="18" w:line="215"/>
-              <w:jc w:val="center"/>
-            </w:pPr>
-            <w:r>
-              <w:rPr>
-                <w:b w:val="false"/>
-                <w:bCs w:val="false"/>
-                <w:color w:val="251727"/>
-                <w:sz w:val="17"/>
-                <w:szCs w:val="17"/>
-              </w:rPr>
-              <w:t xml:space="preserve">3</w:t>
             </w:r>
           </w:p>
         </w:tc>
@@ -9606,7 +9606,7 @@
                 <w:sz w:val="17"/>
                 <w:szCs w:val="17"/>
               </w:rPr>
-              <w:t xml:space="preserve">1</w:t>
+              <w:t xml:space="preserve">3</w:t>
             </w:r>
           </w:p>
         </w:tc>
@@ -9662,7 +9662,7 @@
                 <w:sz w:val="17"/>
                 <w:szCs w:val="17"/>
               </w:rPr>
-              <w:t xml:space="preserve">1</w:t>
+              <w:t xml:space="preserve">0</w:t>
             </w:r>
           </w:p>
         </w:tc>

</xml_diff>

<commit_message>
v0.235 — o capitulo 6 ganha a coluna do Controlador e do Reforco, a Hitotsume vira Emboscador, e as prontas declaram o ataque e os marcos
Co-Authored-By: Claude Opus 5 <noreply@anthropic.com>
</commit_message>
<xml_diff>
--- a/sistema/05-material/bloco-de-inimigo.docx
+++ b/sistema/05-material/bloco-de-inimigo.docx
@@ -2837,7 +2837,7 @@
                 <w:sz w:val="17"/>
                 <w:szCs w:val="17"/>
               </w:rPr>
-              <w:t xml:space="preserve">58</w:t>
+              <w:t xml:space="preserve">46</w:t>
             </w:r>
           </w:p>
         </w:tc>
@@ -3982,7 +3982,7 @@
                 <w:sz w:val="17"/>
                 <w:szCs w:val="17"/>
               </w:rPr>
-              <w:t xml:space="preserve">3</w:t>
+              <w:t xml:space="preserve">3, acerto e CD</w:t>
             </w:r>
           </w:p>
         </w:tc>
@@ -4857,7 +4857,7 @@
                 <w:sz w:val="17"/>
                 <w:szCs w:val="17"/>
               </w:rPr>
-              <w:t xml:space="preserve">3</w:t>
+              <w:t xml:space="preserve">3, acerto e CD</w:t>
             </w:r>
           </w:p>
         </w:tc>
@@ -5820,7 +5820,7 @@
                 <w:sz w:val="17"/>
                 <w:szCs w:val="17"/>
               </w:rPr>
-              <w:t xml:space="preserve">3</w:t>
+              <w:t xml:space="preserve">3, acerto e CD</w:t>
             </w:r>
           </w:p>
         </w:tc>
@@ -6576,7 +6576,7 @@
           <w:sz w:val="18"/>
           <w:szCs w:val="18"/>
         </w:rPr>
-        <w:t xml:space="preserve">Maldição Média · Ameaça · Artilheiro · nível 5 a 8</w:t>
+        <w:t xml:space="preserve">Maldição Média · Ameaça · Emboscador · nível 5 a 8</w:t>
       </w:r>
     </w:p>
     <w:p>
@@ -6937,7 +6937,7 @@
           <w:sz w:val="19"/>
           <w:szCs w:val="19"/>
         </w:rPr>
-        <w:t xml:space="preserve">58</w:t>
+        <w:t xml:space="preserve">46</w:t>
       </w:r>
       <w:r>
         <w:rPr>
@@ -6969,7 +6969,7 @@
           <w:sz w:val="19"/>
           <w:szCs w:val="19"/>
         </w:rPr>
-        <w:t xml:space="preserve">29</w:t>
+        <w:t xml:space="preserve">23</w:t>
       </w:r>
       <w:r>
         <w:rPr>
@@ -7273,7 +7273,7 @@
                 <w:sz w:val="17"/>
                 <w:szCs w:val="17"/>
               </w:rPr>
-              <w:t xml:space="preserve">2</w:t>
+              <w:t xml:space="preserve">2 (3 do nível 6)</w:t>
             </w:r>
           </w:p>
         </w:tc>
@@ -7329,7 +7329,7 @@
                 <w:sz w:val="17"/>
                 <w:szCs w:val="17"/>
               </w:rPr>
-              <w:t xml:space="preserve">3</w:t>
+              <w:t xml:space="preserve">3, acerto e CD</w:t>
             </w:r>
           </w:p>
         </w:tc>
@@ -8434,7 +8434,7 @@
                 <w:sz w:val="17"/>
                 <w:szCs w:val="17"/>
               </w:rPr>
-              <w:t xml:space="preserve">2</w:t>
+              <w:t xml:space="preserve">3</w:t>
             </w:r>
           </w:p>
         </w:tc>
@@ -8462,7 +8462,7 @@
                 <w:sz w:val="17"/>
                 <w:szCs w:val="17"/>
               </w:rPr>
-              <w:t xml:space="preserve">3</w:t>
+              <w:t xml:space="preserve">3 (4 do nível 10), acerto e CD</w:t>
             </w:r>
           </w:p>
         </w:tc>
@@ -9188,7 +9188,7 @@
           <w:sz w:val="19"/>
           <w:szCs w:val="19"/>
         </w:rPr>
-        <w:t xml:space="preserve">+4</w:t>
+        <w:t xml:space="preserve">+5</w:t>
       </w:r>
       <w:r>
         <w:rPr>
@@ -9220,7 +9220,7 @@
           <w:sz w:val="19"/>
           <w:szCs w:val="19"/>
         </w:rPr>
-        <w:t xml:space="preserve">12</w:t>
+        <w:t xml:space="preserve">13</w:t>
       </w:r>
       <w:r>
         <w:rPr>
@@ -9578,7 +9578,7 @@
                 <w:sz w:val="17"/>
                 <w:szCs w:val="17"/>
               </w:rPr>
-              <w:t xml:space="preserve">3</w:t>
+              <w:t xml:space="preserve">3 (4 do nível 6), acerto e CD</w:t>
             </w:r>
           </w:p>
         </w:tc>
@@ -9960,7 +9960,7 @@
         <w:t xml:space="preserve">+4</w:t>
       </w:r>
       <w:r>
-        <w:t xml:space="preserve"> para acertar, alcance </w:t>
+        <w:t xml:space="preserve"> (</w:t>
       </w:r>
       <w:r>
         <w:rPr>
@@ -9969,20 +9969,10 @@
           <w:sz w:val="17"/>
           <w:szCs w:val="17"/>
         </w:rPr>
-        <w:t xml:space="preserve">3 m</w:t>
-      </w:r>
-      <w:r>
-        <w:t xml:space="preserve">, uma criatura. </w:t>
-      </w:r>
-      <w:r>
-        <w:rPr>
-          <w:i/>
-          <w:iCs/>
-        </w:rPr>
-        <w:t xml:space="preserve">Acerto:</w:t>
-      </w:r>
-      <w:r>
-        <w:t xml:space="preserve"> </w:t>
+        <w:t xml:space="preserve">+5</w:t>
+      </w:r>
+      <w:r>
+        <w:t xml:space="preserve"> no nível 6 a 8) para acertar, alcance </w:t>
       </w:r>
       <w:r>
         <w:rPr>
@@ -9991,35 +9981,20 @@
           <w:sz w:val="17"/>
           <w:szCs w:val="17"/>
         </w:rPr>
-        <w:t xml:space="preserve">12 (2d4 + 7)</w:t>
-      </w:r>
-      <w:r>
-        <w:t xml:space="preserve"> de dano de Concussão, e metade desse dano em um vizinho do alvo.</w:t>
-      </w:r>
-    </w:p>
-    <w:p>
-      <w:pPr>
-        <w:spacing w:after="70" w:before="0" w:line="232"/>
-      </w:pPr>
-      <w:r>
-        <w:rPr>
-          <w:b/>
-          <w:bCs/>
-        </w:rPr>
-        <w:t xml:space="preserve">Pancada no Chão.</w:t>
-      </w:r>
-      <w:r>
-        <w:t xml:space="preserve"> </w:t>
+        <w:t xml:space="preserve">3 m</w:t>
+      </w:r>
+      <w:r>
+        <w:t xml:space="preserve">, uma criatura. </w:t>
       </w:r>
       <w:r>
         <w:rPr>
           <w:i/>
           <w:iCs/>
         </w:rPr>
-        <w:t xml:space="preserve">Teste de Resistência Físico:</w:t>
-      </w:r>
-      <w:r>
-        <w:t xml:space="preserve"> CD </w:t>
+        <w:t xml:space="preserve">Acerto:</w:t>
+      </w:r>
+      <w:r>
+        <w:t xml:space="preserve"> </w:t>
       </w:r>
       <w:r>
         <w:rPr>
@@ -10028,10 +10003,35 @@
           <w:sz w:val="17"/>
           <w:szCs w:val="17"/>
         </w:rPr>
-        <w:t xml:space="preserve">12</w:t>
-      </w:r>
-      <w:r>
-        <w:t xml:space="preserve">, cada criatura numa </w:t>
+        <w:t xml:space="preserve">12 (2d4 + 7)</w:t>
+      </w:r>
+      <w:r>
+        <w:t xml:space="preserve"> de dano de Concussão, e metade desse dano em um vizinho do alvo.</w:t>
+      </w:r>
+    </w:p>
+    <w:p>
+      <w:pPr>
+        <w:spacing w:after="70" w:before="0" w:line="232"/>
+      </w:pPr>
+      <w:r>
+        <w:rPr>
+          <w:b/>
+          <w:bCs/>
+        </w:rPr>
+        <w:t xml:space="preserve">Pancada no Chão.</w:t>
+      </w:r>
+      <w:r>
+        <w:t xml:space="preserve"> </w:t>
+      </w:r>
+      <w:r>
+        <w:rPr>
+          <w:i/>
+          <w:iCs/>
+        </w:rPr>
+        <w:t xml:space="preserve">Teste de Resistência Físico:</w:t>
+      </w:r>
+      <w:r>
+        <w:t xml:space="preserve"> CD </w:t>
       </w:r>
       <w:r>
         <w:rPr>
@@ -10040,10 +10040,10 @@
           <w:sz w:val="17"/>
           <w:szCs w:val="17"/>
         </w:rPr>
-        <w:t xml:space="preserve">Esfera</w:t>
-      </w:r>
-      <w:r>
-        <w:t xml:space="preserve"> de raio </w:t>
+        <w:t xml:space="preserve">12</w:t>
+      </w:r>
+      <w:r>
+        <w:t xml:space="preserve"> (</w:t>
       </w:r>
       <w:r>
         <w:rPr>
@@ -10052,20 +10052,10 @@
           <w:sz w:val="17"/>
           <w:szCs w:val="17"/>
         </w:rPr>
-        <w:t xml:space="preserve">3 m</w:t>
-      </w:r>
-      <w:r>
-        <w:t xml:space="preserve"> a partir do corpo dele. </w:t>
-      </w:r>
-      <w:r>
-        <w:rPr>
-          <w:i/>
-          <w:iCs/>
-        </w:rPr>
-        <w:t xml:space="preserve">Falha:</w:t>
-      </w:r>
-      <w:r>
-        <w:t xml:space="preserve"> </w:t>
+        <w:t xml:space="preserve">13</w:t>
+      </w:r>
+      <w:r>
+        <w:t xml:space="preserve"> no nível 6 a 8), cada criatura numa </w:t>
       </w:r>
       <w:r>
         <w:rPr>
@@ -10074,6 +10064,40 @@
           <w:sz w:val="17"/>
           <w:szCs w:val="17"/>
         </w:rPr>
+        <w:t xml:space="preserve">Esfera</w:t>
+      </w:r>
+      <w:r>
+        <w:t xml:space="preserve"> de raio </w:t>
+      </w:r>
+      <w:r>
+        <w:rPr>
+          <w:rFonts w:ascii="Consolas" w:cs="Consolas" w:eastAsia="Consolas" w:hAnsi="Consolas"/>
+          <w:color w:val="2B1B2E"/>
+          <w:sz w:val="17"/>
+          <w:szCs w:val="17"/>
+        </w:rPr>
+        <w:t xml:space="preserve">3 m</w:t>
+      </w:r>
+      <w:r>
+        <w:t xml:space="preserve"> a partir do corpo dele. </w:t>
+      </w:r>
+      <w:r>
+        <w:rPr>
+          <w:i/>
+          <w:iCs/>
+        </w:rPr>
+        <w:t xml:space="preserve">Falha:</w:t>
+      </w:r>
+      <w:r>
+        <w:t xml:space="preserve"> </w:t>
+      </w:r>
+      <w:r>
+        <w:rPr>
+          <w:rFonts w:ascii="Consolas" w:cs="Consolas" w:eastAsia="Consolas" w:hAnsi="Consolas"/>
+          <w:color w:val="2B1B2E"/>
+          <w:sz w:val="17"/>
+          <w:szCs w:val="17"/>
+        </w:rPr>
         <w:t xml:space="preserve">12 (2d4 + 7)</w:t>
       </w:r>
       <w:r>
@@ -10163,7 +10187,19 @@
         <w:t xml:space="preserve">12</w:t>
       </w:r>
       <w:r>
-        <w:t xml:space="preserve">, uma criatura a até </w:t>
+        <w:t xml:space="preserve"> (</w:t>
+      </w:r>
+      <w:r>
+        <w:rPr>
+          <w:rFonts w:ascii="Consolas" w:cs="Consolas" w:eastAsia="Consolas" w:hAnsi="Consolas"/>
+          <w:color w:val="2B1B2E"/>
+          <w:sz w:val="17"/>
+          <w:szCs w:val="17"/>
+        </w:rPr>
+        <w:t xml:space="preserve">13</w:t>
+      </w:r>
+      <w:r>
+        <w:t xml:space="preserve"> no nível 6 a 8), uma criatura a até </w:t>
       </w:r>
       <w:r>
         <w:rPr>

</xml_diff>

<commit_message>
v0.239 — o Rescaldo ganha a Regravacao; a energia temporaria segue a regra da vida temporaria; a ficha em papel imprime as Familias do manual (B4) e volta a 3 paginas; as tabelas deixam de ficar orfas no pe da pagina; o B17 sai da fila
Co-Authored-By: Claude Opus 5 <noreply@anthropic.com>
</commit_message>
<xml_diff>
--- a/sistema/05-material/bloco-de-inimigo.docx
+++ b/sistema/05-material/bloco-de-inimigo.docx
@@ -3260,7 +3260,7 @@
     </w:p>
     <w:p>
       <w:pPr>
-        <w:spacing w:after="96" w:before="36"/>
+        <w:spacing w:after="48" w:before="36"/>
       </w:pPr>
       <w:r>
         <w:rPr>
@@ -10355,9 +10355,9 @@
             <w:tcW w:type="dxa" w:w="9600"/>
             <w:shd w:fill="2B1B2E" w:color="auto" w:val="clear"/>
             <w:tcMar>
-              <w:top w:type="dxa" w:w="50"/>
+              <w:top w:type="dxa" w:w="34"/>
               <w:left w:type="dxa" w:w="150"/>
-              <w:bottom w:type="dxa" w:w="50"/>
+              <w:bottom w:type="dxa" w:w="34"/>
               <w:right w:type="dxa" w:w="150"/>
             </w:tcMar>
           </w:tcPr>
@@ -10550,7 +10550,7 @@
     </w:p>
     <w:p>
       <w:pPr>
-        <w:spacing w:after="96" w:before="36"/>
+        <w:spacing w:after="48" w:before="36"/>
       </w:pPr>
       <w:r>
         <w:rPr>
@@ -10730,9 +10730,9 @@
             <w:tcW w:type="dxa" w:w="9600"/>
             <w:shd w:fill="2B1B2E" w:color="auto" w:val="clear"/>
             <w:tcMar>
-              <w:top w:type="dxa" w:w="50"/>
+              <w:top w:type="dxa" w:w="34"/>
               <w:left w:type="dxa" w:w="150"/>
-              <w:bottom w:type="dxa" w:w="50"/>
+              <w:bottom w:type="dxa" w:w="34"/>
               <w:right w:type="dxa" w:w="150"/>
             </w:tcMar>
           </w:tcPr>
@@ -12245,9 +12245,9 @@
             <w:tcW w:type="dxa" w:w="9600"/>
             <w:shd w:fill="2B1B2E" w:color="auto" w:val="clear"/>
             <w:tcMar>
-              <w:top w:type="dxa" w:w="50"/>
+              <w:top w:type="dxa" w:w="34"/>
               <w:left w:type="dxa" w:w="150"/>
-              <w:bottom w:type="dxa" w:w="50"/>
+              <w:bottom w:type="dxa" w:w="34"/>
               <w:right w:type="dxa" w:w="150"/>
             </w:tcMar>
           </w:tcPr>
@@ -13784,9 +13784,9 @@
             <w:tcW w:type="dxa" w:w="9600"/>
             <w:shd w:fill="2B1B2E" w:color="auto" w:val="clear"/>
             <w:tcMar>
-              <w:top w:type="dxa" w:w="50"/>
+              <w:top w:type="dxa" w:w="34"/>
               <w:left w:type="dxa" w:w="150"/>
-              <w:bottom w:type="dxa" w:w="50"/>
+              <w:bottom w:type="dxa" w:w="34"/>
               <w:right w:type="dxa" w:w="150"/>
             </w:tcMar>
           </w:tcPr>
@@ -15041,7 +15041,7 @@
     </w:tbl>
     <w:p>
       <w:pPr>
-        <w:spacing w:after="96" w:before="36"/>
+        <w:spacing w:after="48" w:before="36"/>
       </w:pPr>
       <w:r>
         <w:rPr>
@@ -15127,9 +15127,9 @@
             <w:tcW w:type="dxa" w:w="9600"/>
             <w:shd w:fill="2B1B2E" w:color="auto" w:val="clear"/>
             <w:tcMar>
-              <w:top w:type="dxa" w:w="50"/>
+              <w:top w:type="dxa" w:w="34"/>
               <w:left w:type="dxa" w:w="150"/>
-              <w:bottom w:type="dxa" w:w="50"/>
+              <w:bottom w:type="dxa" w:w="34"/>
               <w:right w:type="dxa" w:w="150"/>
             </w:tcMar>
           </w:tcPr>
@@ -16215,7 +16215,7 @@
     </w:tbl>
     <w:p>
       <w:pPr>
-        <w:spacing w:after="96" w:before="36"/>
+        <w:spacing w:after="48" w:before="36"/>
       </w:pPr>
       <w:r>
         <w:rPr>
@@ -16279,9 +16279,9 @@
             <w:tcW w:type="dxa" w:w="9600"/>
             <w:shd w:fill="2B1B2E" w:color="auto" w:val="clear"/>
             <w:tcMar>
-              <w:top w:type="dxa" w:w="50"/>
+              <w:top w:type="dxa" w:w="34"/>
               <w:left w:type="dxa" w:w="150"/>
-              <w:bottom w:type="dxa" w:w="50"/>
+              <w:bottom w:type="dxa" w:w="34"/>
               <w:right w:type="dxa" w:w="150"/>
             </w:tcMar>
           </w:tcPr>
@@ -16942,7 +16942,7 @@
     </w:tbl>
     <w:p>
       <w:pPr>
-        <w:spacing w:after="96" w:before="36"/>
+        <w:spacing w:after="48" w:before="36"/>
       </w:pPr>
       <w:r>
         <w:rPr>
@@ -16984,9 +16984,9 @@
             <w:tcW w:type="dxa" w:w="9600"/>
             <w:shd w:fill="2B1B2E" w:color="auto" w:val="clear"/>
             <w:tcMar>
-              <w:top w:type="dxa" w:w="50"/>
+              <w:top w:type="dxa" w:w="34"/>
               <w:left w:type="dxa" w:w="150"/>
-              <w:bottom w:type="dxa" w:w="50"/>
+              <w:bottom w:type="dxa" w:w="34"/>
               <w:right w:type="dxa" w:w="150"/>
             </w:tcMar>
           </w:tcPr>
@@ -17503,7 +17503,7 @@
     </w:tbl>
     <w:p>
       <w:pPr>
-        <w:spacing w:after="96" w:before="36"/>
+        <w:spacing w:after="48" w:before="36"/>
       </w:pPr>
       <w:r>
         <w:rPr>
@@ -17629,9 +17629,9 @@
             <w:tcW w:type="dxa" w:w="9600"/>
             <w:shd w:fill="2B1B2E" w:color="auto" w:val="clear"/>
             <w:tcMar>
-              <w:top w:type="dxa" w:w="50"/>
+              <w:top w:type="dxa" w:w="34"/>
               <w:left w:type="dxa" w:w="150"/>
-              <w:bottom w:type="dxa" w:w="50"/>
+              <w:bottom w:type="dxa" w:w="34"/>
               <w:right w:type="dxa" w:w="150"/>
             </w:tcMar>
           </w:tcPr>
@@ -18316,9 +18316,9 @@
             <w:tcW w:type="dxa" w:w="9600"/>
             <w:shd w:fill="2B1B2E" w:color="auto" w:val="clear"/>
             <w:tcMar>
-              <w:top w:type="dxa" w:w="50"/>
+              <w:top w:type="dxa" w:w="34"/>
               <w:left w:type="dxa" w:w="150"/>
-              <w:bottom w:type="dxa" w:w="50"/>
+              <w:bottom w:type="dxa" w:w="34"/>
               <w:right w:type="dxa" w:w="150"/>
             </w:tcMar>
           </w:tcPr>
@@ -19123,7 +19123,7 @@
     </w:tbl>
     <w:p>
       <w:pPr>
-        <w:spacing w:after="96" w:before="36"/>
+        <w:spacing w:after="48" w:before="36"/>
       </w:pPr>
       <w:r>
         <w:rPr>

</xml_diff>

<commit_message>
v0.333: migração, passo 2, segunda metade — a família da Passiva
Passiva vira Talento, Classe Passiva vira Categoria de Efeito (CE),
Passiva Livre vira Expressão da técnica e Passiva Própria vira Talento
Próprio (NT04 a NT06 do livro reconstruído). Vinte peças e quatro
documentos vivos, concordância relida; dois trechos históricos guardam o
nome antigo de propósito.

Cinco validadores passam a procurar o nome novo nas peças e traduzem o
que leem do livro v0.331, do .docx e do partE.js pelo renomes.py. Os
geradores da ficha e do inimigo e os três .docx acompanham.

O livro final, Ciclo Maldito R28a, foi comparado com a candidata: 3.787
de 3.966 parágrafos inteiros e nenhuma regra diferente; ele é a
candidata de antes da D43. Registro no PLANO e no CHANGELOG.

Bateria de 32 de 32 com o pulo de sempre; seis perturbações e dois
contra-testes numa cópia isolada.

Co-Authored-By: Claude Opus 5.5 <noreply@anthropic.com>
Claude-Session: https://claude.ai/code/session_01QshZjrpLXraNKg5CKMsdNG
</commit_message>
<xml_diff>
--- a/sistema/05-material/bloco-de-inimigo.docx
+++ b/sistema/05-material/bloco-de-inimigo.docx
@@ -715,7 +715,7 @@
                 <w:sz w:val="13"/>
                 <w:szCs w:val="13"/>
               </w:rPr>
-              <w:t xml:space="preserve">TRAÇOS — PASSIVAS, APTIDÕES E TÉCNICA</w:t>
+              <w:t xml:space="preserve">TRAÇOS — TALENTOS, APTIDÕES E TÉCNICA</w:t>
             </w:r>
           </w:p>
           <w:p>
@@ -1667,7 +1667,7 @@
                 <w:sz w:val="13"/>
                 <w:szCs w:val="13"/>
               </w:rPr>
-              <w:t xml:space="preserve">TRAÇOS — PASSIVAS, APTIDÕES E TÉCNICA</w:t>
+              <w:t xml:space="preserve">TRAÇOS — TALENTOS, APTIDÕES E TÉCNICA</w:t>
             </w:r>
           </w:p>
           <w:p>
@@ -1679,7 +1679,7 @@
                 <w:sz w:val="19"/>
                 <w:szCs w:val="19"/>
               </w:rPr>
-              <w:t xml:space="preserve">Escama (Passiva) · duas aptidões do catálogo da peça 11</w:t>
+              <w:t xml:space="preserve">Escama (Talento) · duas aptidões do catálogo da peça 11</w:t>
             </w:r>
           </w:p>
         </w:tc>

</xml_diff>

<commit_message>
v0.334: o sistema passa a se chamar Ciclo Maldito
Nome trocado no README, LEIA-ME, topo do ESTADO-ATUAL, arquitetura,
peça 26 e gerador do bloco de inimigo (.docx regerado). O conferir-nomes
trata Projeto - M e Projeto M como nome aposentado. Bastião e Catálogo
ganharam o cotejo do CHANGELOG e da peça 26, e o ZIP foi remontado
(fdaa59fc…), reproduzindo o PDF 25557bb0… numa pasta isolada.

Co-Authored-By: Claude Opus 5.5 <noreply@anthropic.com>
Claude-Session: https://claude.ai/code/session_01QshZjrpLXraNKg5CKMsdNG
</commit_message>
<xml_diff>
--- a/sistema/05-material/bloco-de-inimigo.docx
+++ b/sistema/05-material/bloco-de-inimigo.docx
@@ -15,7 +15,7 @@
           <w:sz w:val="15"/>
           <w:szCs w:val="15"/>
         </w:rPr>
-        <w:t xml:space="preserve">PROJETO - M</w:t>
+        <w:t xml:space="preserve">CICLO MALDITO</w:t>
       </w:r>
     </w:p>
     <w:p>
@@ -960,7 +960,7 @@
           <w:sz w:val="15"/>
           <w:szCs w:val="15"/>
         </w:rPr>
-        <w:t xml:space="preserve">PROJETO - M</w:t>
+        <w:t xml:space="preserve">CICLO MALDITO</w:t>
       </w:r>
     </w:p>
     <w:p>
@@ -1904,7 +1904,7 @@
           <w:sz w:val="15"/>
           <w:szCs w:val="15"/>
         </w:rPr>
-        <w:t xml:space="preserve">PROJETO - M</w:t>
+        <w:t xml:space="preserve">CICLO MALDITO</w:t>
       </w:r>
     </w:p>
     <w:p>
@@ -3375,7 +3375,7 @@
           <w:sz w:val="15"/>
           <w:szCs w:val="15"/>
         </w:rPr>
-        <w:t xml:space="preserve">PROJETO - M</w:t>
+        <w:t xml:space="preserve">CICLO MALDITO</w:t>
       </w:r>
     </w:p>
     <w:p>
@@ -4334,7 +4334,7 @@
           <w:sz w:val="15"/>
           <w:szCs w:val="15"/>
         </w:rPr>
-        <w:t xml:space="preserve">PROJETO - M</w:t>
+        <w:t xml:space="preserve">CICLO MALDITO</w:t>
       </w:r>
     </w:p>
     <w:p>
@@ -5293,7 +5293,7 @@
           <w:sz w:val="15"/>
           <w:szCs w:val="15"/>
         </w:rPr>
-        <w:t xml:space="preserve">PROJETO - M</w:t>
+        <w:t xml:space="preserve">CICLO MALDITO</w:t>
       </w:r>
     </w:p>
     <w:p>
@@ -6548,7 +6548,7 @@
           <w:sz w:val="15"/>
           <w:szCs w:val="15"/>
         </w:rPr>
-        <w:t xml:space="preserve">PROJETO - M</w:t>
+        <w:t xml:space="preserve">CICLO MALDITO</w:t>
       </w:r>
     </w:p>
     <w:p>
@@ -7681,7 +7681,7 @@
           <w:sz w:val="15"/>
           <w:szCs w:val="15"/>
         </w:rPr>
-        <w:t xml:space="preserve">PROJETO - M</w:t>
+        <w:t xml:space="preserve">CICLO MALDITO</w:t>
       </w:r>
     </w:p>
     <w:p>
@@ -8909,7 +8909,7 @@
           <w:sz w:val="15"/>
           <w:szCs w:val="15"/>
         </w:rPr>
-        <w:t xml:space="preserve">PROJETO - M</w:t>
+        <w:t xml:space="preserve">CICLO MALDITO</w:t>
       </w:r>
     </w:p>
     <w:p>
@@ -10335,7 +10335,7 @@
           <w:sz w:val="15"/>
           <w:szCs w:val="15"/>
         </w:rPr>
-        <w:t xml:space="preserve">PROJETO - M</w:t>
+        <w:t xml:space="preserve">CICLO MALDITO</w:t>
       </w:r>
     </w:p>
     <w:p>
@@ -25546,7 +25546,7 @@
         <w:sz w:val="14"/>
         <w:szCs w:val="14"/>
       </w:rPr>
-      <w:t xml:space="preserve">Projeto - M · bloco de inimigo · peça 26</w:t>
+      <w:t xml:space="preserve">Ciclo Maldito · bloco de inimigo · peça 26</w:t>
     </w:r>
   </w:p>
 </w:ftr>

</xml_diff>